<commit_message>
Align Math Desk units to Renjiao Grade 4A textbook (9 units).
Remap path/printables/daily banks to U1–U9; demote 数量关系 to extra; add stubs for hectares, division, stats, optimization, and review.

Co-authored-by: Cursor <cursoragent@cursor.com>
</commit_message>
<xml_diff>
--- a/printables/u01/05-错题库/u01-错题重练-模板.docx
+++ b/printables/u01/05-错题库/u01-错题重练-模板.docx
@@ -4,7 +4,7 @@
   <w:body>
     <w:p>
       <w:pPr>
-        <w:spacing w:before="0" w:after="80" w:line="240" w:lineRule="auto"/>
+        <w:spacing w:after="120"/>
         <w:jc w:val="center"/>
       </w:pPr>
       <w:r>
@@ -12,84 +12,42 @@
           <w:rFonts w:ascii="宋体" w:hAnsi="宋体" w:eastAsia="宋体"/>
           <w:b/>
           <w:color w:val="1E7EB8"/>
-          <w:sz w:val="30"/>
+          <w:sz w:val="28"/>
         </w:rPr>
-        <w:t>数学书桌 · Math Desk</w:t>
+        <w:t>数学书桌 · 错题重练</w:t>
       </w:r>
     </w:p>
     <w:p>
       <w:pPr>
-        <w:spacing w:before="0" w:after="80" w:line="240" w:lineRule="auto"/>
-        <w:jc w:val="center"/>
-      </w:pPr>
-      <w:r>
-        <w:rPr>
-          <w:rFonts w:ascii="宋体" w:hAnsi="宋体" w:eastAsia="宋体"/>
-          <w:b/>
-          <w:color w:val="0F5F8A"/>
-          <w:sz w:val="26"/>
-        </w:rPr>
-        <w:t>四上 · 大数的认识 · 错题重练纸</w:t>
-      </w:r>
-    </w:p>
-    <w:p>
-      <w:pPr>
-        <w:spacing w:before="0" w:after="80" w:line="240" w:lineRule="auto"/>
+        <w:spacing w:after="120"/>
         <w:jc w:val="center"/>
       </w:pPr>
       <w:r>
         <w:rPr>
           <w:rFonts w:ascii="宋体" w:hAnsi="宋体" w:eastAsia="宋体"/>
           <w:b w:val="0"/>
-          <w:color w:val="1E7EB8"/>
-          <w:sz w:val="18"/>
+          <w:sz w:val="24"/>
         </w:rPr>
-        <w:t>限时 按错题量　|　计算错 / 概念错分开　|　番茄钟自计时</w:t>
+        <w:t>第一单元 · 大数的认识</w:t>
       </w:r>
     </w:p>
     <w:p>
       <w:pPr>
-        <w:spacing w:before="0" w:after="160" w:line="240" w:lineRule="auto"/>
-      </w:pPr>
-      <w:r>
-        <w:rPr>
-          <w:rFonts w:ascii="宋体" w:hAnsi="宋体" w:eastAsia="宋体"/>
-          <w:b w:val="0"/>
-          <w:sz w:val="20"/>
-        </w:rPr>
-        <w:t>姓名：________　日期：________　完成：____　正确：____</w:t>
-      </w:r>
-    </w:p>
-    <w:p>
-      <w:pPr>
-        <w:spacing w:before="0" w:after="160" w:line="240" w:lineRule="auto"/>
-      </w:pPr>
-      <w:r>
-        <w:rPr>
-          <w:rFonts w:ascii="宋体" w:hAnsi="宋体" w:eastAsia="宋体"/>
-          <w:b w:val="0"/>
-          <w:sz w:val="20"/>
-        </w:rPr>
-        <w:t>来源：□日常计算 □重难点 □应用题 □考前测试　日期：________</w:t>
-      </w:r>
-    </w:p>
-    <w:p>
-      <w:pPr>
-        <w:spacing w:before="0" w:after="80" w:line="240" w:lineRule="auto"/>
+        <w:spacing w:after="120"/>
       </w:pPr>
       <w:r>
         <w:rPr>
           <w:rFonts w:ascii="宋体" w:hAnsi="宋体" w:eastAsia="宋体"/>
           <w:b/>
-          <w:color w:val="0F5F8A"/>
+          <w:color w:val="1E7EB8"/>
           <w:sz w:val="24"/>
         </w:rPr>
-        <w:t>【计算错】重练（对齐、进退位、口诀、数位）</w:t>
+        <w:t>计算错：</w:t>
       </w:r>
     </w:p>
     <w:p>
       <w:pPr>
-        <w:spacing w:before="0" w:after="80" w:line="240" w:lineRule="auto"/>
+        <w:spacing w:after="120"/>
       </w:pPr>
       <w:r>
         <w:rPr>
@@ -97,12 +55,26 @@
           <w:b w:val="0"/>
           <w:sz w:val="22"/>
         </w:rPr>
-        <w:t>1. 原错：__________　重做：__________ ＝ ______</w:t>
+        <w:t>1. ________________  订正：________________</w:t>
       </w:r>
     </w:p>
     <w:p>
       <w:pPr>
-        <w:spacing w:before="0" w:after="80" w:line="240" w:lineRule="auto"/>
+        <w:spacing w:after="120"/>
+      </w:pPr>
+      <w:r>
+        <w:rPr>
+          <w:rFonts w:ascii="宋体" w:hAnsi="宋体" w:eastAsia="宋体"/>
+          <w:b/>
+          <w:color w:val="1E7EB8"/>
+          <w:sz w:val="24"/>
+        </w:rPr>
+        <w:t>概念错：</w:t>
+      </w:r>
+    </w:p>
+    <w:p>
+      <w:pPr>
+        <w:spacing w:after="120"/>
       </w:pPr>
       <w:r>
         <w:rPr>
@@ -110,91 +82,12 @@
           <w:b w:val="0"/>
           <w:sz w:val="22"/>
         </w:rPr>
-        <w:t>2. 原错：__________　重做：__________ ＝ ______</w:t>
-      </w:r>
-    </w:p>
-    <w:p>
-      <w:pPr>
-        <w:spacing w:before="0" w:after="80" w:line="240" w:lineRule="auto"/>
-      </w:pPr>
-      <w:r>
-        <w:rPr>
-          <w:rFonts w:ascii="宋体" w:hAnsi="宋体" w:eastAsia="宋体"/>
-          <w:b w:val="0"/>
-          <w:sz w:val="22"/>
-        </w:rPr>
-        <w:t>3. 原错：__________　重做：__________ ＝ ______</w:t>
-      </w:r>
-    </w:p>
-    <w:p>
-      <w:pPr>
-        <w:spacing w:before="0" w:after="80" w:line="240" w:lineRule="auto"/>
-      </w:pPr>
-      <w:r>
-        <w:rPr>
-          <w:rFonts w:ascii="宋体" w:hAnsi="宋体" w:eastAsia="宋体"/>
-          <w:b w:val="0"/>
-          <w:sz w:val="22"/>
-        </w:rPr>
-        <w:t>4. 原错：__________　重做：__________ ＝ ______</w:t>
-      </w:r>
-    </w:p>
-    <w:p>
-      <w:pPr>
-        <w:spacing w:before="0" w:after="80" w:line="240" w:lineRule="auto"/>
-      </w:pPr>
-      <w:r>
-        <w:rPr>
-          <w:rFonts w:ascii="宋体" w:hAnsi="宋体" w:eastAsia="宋体"/>
-          <w:b/>
-          <w:color w:val="0F5F8A"/>
-          <w:sz w:val="24"/>
-        </w:rPr>
-        <w:t>【概念错】用一句话写对</w:t>
-      </w:r>
-    </w:p>
-    <w:p>
-      <w:pPr>
-        <w:spacing w:before="0" w:after="80" w:line="240" w:lineRule="auto"/>
-      </w:pPr>
-      <w:r>
-        <w:rPr>
-          <w:rFonts w:ascii="宋体" w:hAnsi="宋体" w:eastAsia="宋体"/>
-          <w:b w:val="0"/>
-          <w:sz w:val="22"/>
-        </w:rPr>
-        <w:t>1. 错因：__________　正解：______________________________</w:t>
-      </w:r>
-    </w:p>
-    <w:p>
-      <w:pPr>
-        <w:spacing w:before="0" w:after="80" w:line="240" w:lineRule="auto"/>
-      </w:pPr>
-      <w:r>
-        <w:rPr>
-          <w:rFonts w:ascii="宋体" w:hAnsi="宋体" w:eastAsia="宋体"/>
-          <w:b w:val="0"/>
-          <w:sz w:val="22"/>
-        </w:rPr>
-        <w:t>2. 错因：__________　正解：______________________________</w:t>
-      </w:r>
-    </w:p>
-    <w:p>
-      <w:pPr>
-        <w:spacing w:before="0" w:after="80" w:line="240" w:lineRule="auto"/>
-      </w:pPr>
-      <w:r>
-        <w:rPr>
-          <w:rFonts w:ascii="宋体" w:hAnsi="宋体" w:eastAsia="宋体"/>
-          <w:b w:val="0"/>
-          <w:sz w:val="22"/>
-        </w:rPr>
-        <w:t>3. 错因：__________　正解：______________________________</w:t>
+        <w:t>1. ________________  订正：________________</w:t>
       </w:r>
     </w:p>
     <w:sectPr>
-      <w:pgSz w:w="11906" w:h="16838"/>
-      <w:pgMar w:top="737" w:right="907" w:bottom="737" w:left="907" w:header="720" w:footer="720" w:gutter="0"/>
+      <w:pgSz w:w="12240" w:h="15840"/>
+      <w:pgMar w:top="1440" w:right="1800" w:bottom="1440" w:left="1800" w:header="720" w:footer="720" w:gutter="0"/>
       <w:cols w:space="720"/>
       <w:docGrid w:linePitch="360"/>
     </w:sectPr>

</xml_diff>